<commit_message>
docs: add syslog security documentation and acceptance scenarios
</commit_message>
<xml_diff>
--- a/docs/security/01_Bezpecnostni_prehled_pro_auditora_se_screenshoty.docx
+++ b/docs/security/01_Bezpecnostni_prehled_pro_auditora_se_screenshoty.docx
@@ -1682,6 +1682,168 @@
     </w:p>
     <w:p>
       <w:pPr>
+        <w:pStyle w:val="Heading2"/>
+        <w:spacing w:after="140"/>
+      </w:pPr>
+      <w:r>
+        <w:t>6.1 Vzdálený syslog</w:t>
+      </w:r>
+    </w:p>
+    <w:p>
+      <w:pPr>
+        <w:spacing w:after="140"/>
+      </w:pPr>
+      <w:r>
+        <w:t>Doplněno 8. 10. 2026 pro zdrojové rozšíření ConsolePi+ 1.9.1 ve větvi codex/syslog-1.9.1 (PR 22). Původní image a archivy vydané 2. 10. 2026 syslog neobsahují. Na cílovém RPi zatím nebylo dokončeno ověření této funkce. Místní automatické kontroly zdrojů nenahrazují akceptaci konkrétní instalace.</w:t>
+      </w:r>
+    </w:p>
+    <w:p>
+      <w:pPr>
+        <w:spacing w:after="140"/>
+      </w:pPr>
+      <w:r>
+        <w:t>Odesílání je výchozím nastavením vypnuté. Správce jej zapne v Systém → Logování → Vzdálený syslog a určí DNS jméno nebo IP serveru, port, transport a maximální číselnou severity. Práh zahrnuje i všechny závažnější úrovně: Warning (4) propustí 0–4, výchozí Informational (6) propustí 0–6. Rozsah je 0 Emergency až 7 Debug. Filtr sám nevytváří nové auditní události ani nezapíná diagnostiku.</w:t>
+      </w:r>
+    </w:p>
+    <w:p>
+      <w:pPr>
+        <w:keepNext/>
+        <w:spacing w:after="140"/>
+      </w:pPr>
+      <w:r>
+        <w:drawing>
+          <wp:inline xmlns:a="http://schemas.openxmlformats.org/drawingml/2006/main" xmlns:pic="http://schemas.openxmlformats.org/drawingml/2006/picture">
+            <wp:extent cx="6035040" cy="4599035"/>
+            <wp:docPr id="12" name="Picture 12" descr="Obrázek S17  Nastavení vzdáleného syslogu. Lokální náhled šablony zdrojového rozšíření z 8. 10. 2026. Ukazuje vypnuté odesílání, transport TCP/TLS, port 6514, práh Informational (6), volitelnou veřejnou CA a stav fronty. Nejde o snímek nasazené funkce na RPi ani důkaz doručení na server."/>
+            <wp:cNvGraphicFramePr>
+              <a:graphicFrameLocks noChangeAspect="1"/>
+            </wp:cNvGraphicFramePr>
+            <a:graphic>
+              <a:graphicData uri="http://schemas.openxmlformats.org/drawingml/2006/picture">
+                <pic:pic>
+                  <pic:nvPicPr>
+                    <pic:cNvPr id="0" name="syslog-preview.png"/>
+                    <pic:cNvPicPr/>
+                  </pic:nvPicPr>
+                  <pic:blipFill>
+                    <a:blip r:embed="rId22"/>
+                    <a:stretch>
+                      <a:fillRect/>
+                    </a:stretch>
+                  </pic:blipFill>
+                  <pic:spPr>
+                    <a:xfrm>
+                      <a:off x="0" y="0"/>
+                      <a:ext cx="6035040" cy="4599035"/>
+                    </a:xfrm>
+                    <a:prstGeom prst="rect"/>
+                  </pic:spPr>
+                </pic:pic>
+              </a:graphicData>
+            </a:graphic>
+          </wp:inline>
+        </w:drawing>
+      </w:r>
+    </w:p>
+    <w:p>
+      <w:pPr>
+        <w:pStyle w:val="Caption"/>
+        <w:keepLines/>
+        <w:spacing w:after="140"/>
+      </w:pPr>
+      <w:r>
+        <w:rPr>
+          <w:b/>
+          <w:sz w:val="18"/>
+        </w:rPr>
+        <w:t xml:space="preserve">Obrázek S17  Nastavení vzdáleného syslogu. </w:t>
+      </w:r>
+      <w:r>
+        <w:rPr>
+          <w:b w:val="0"/>
+          <w:sz w:val="18"/>
+        </w:rPr>
+        <w:t>Lokální náhled šablony zdrojového rozšíření z 8. 10. 2026. Ukazuje vypnuté odesílání, transport TCP/TLS, port 6514, práh Informational (6), volitelnou veřejnou CA a stav fronty. Nejde o snímek nasazené funkce na RPi ani důkaz doručení na server.</w:t>
+      </w:r>
+    </w:p>
+    <w:p>
+      <w:pPr>
+        <w:pStyle w:val="Heading3"/>
+        <w:spacing w:after="140"/>
+      </w:pPr>
+      <w:r>
+        <w:t>Rozsah přenosu a ochrana údajů</w:t>
+      </w:r>
+    </w:p>
+    <w:p>
+      <w:pPr>
+        <w:spacing w:after="140"/>
+      </w:pPr>
+      <w:r>
+        <w:t>Přenášejí se vybrané existující události ConsolePi+, SSH autentizace, výsledek webového přihlášení, kernelové nft-input-drop a chyby vybraných systémových služeb. Webový audit obsahuje pouze výsledek a IP klienta. Sériové přepisy se nečtou a neodesílají; události však mohou obsahovat účet, adresu, port a označení zařízení. Přístup, retenci a dohled nad výpadky musí organizace nastavit také na přijímajícím serveru.</w:t>
+      </w:r>
+    </w:p>
+    <w:p>
+      <w:pPr>
+        <w:pStyle w:val="Heading3"/>
+        <w:spacing w:after="140"/>
+      </w:pPr>
+      <w:r>
+        <w:t>Transport a důvěra</w:t>
+      </w:r>
+    </w:p>
+    <w:p>
+      <w:pPr>
+        <w:spacing w:after="140"/>
+      </w:pPr>
+      <w:r>
+        <w:t>Výchozí TCP/TLS na portu 6514 ověřuje důvěryhodnost certifikátu a shodu DNS jména nebo IP. Prázdná CA znamená systémové důvěryhodné CA, vlastní interní PKI lze zadat veřejným PEM certifikátem. Privátní klíč se nevkládá. Prosté TCP je výslovně volitelné a nešifrované; UDP a klientské certifikáty mTLS nejsou podporované. Chyba TLS nezpůsobí automatický přechod na prosté TCP.</w:t>
+      </w:r>
+    </w:p>
+    <w:p>
+      <w:pPr>
+        <w:pStyle w:val="Heading3"/>
+        <w:spacing w:after="140"/>
+      </w:pPr>
+      <w:r>
+        <w:t>Fronta a průkaznost doručení</w:t>
+      </w:r>
+    </w:p>
+    <w:p>
+      <w:pPr>
+        <w:spacing w:after="140"/>
+      </w:pPr>
+      <w:r>
+        <w:t>Samostatná služba uchovává nejvýše 2 000 zpráv a při zaplnění zahazuje nejstarší se zvýšením počitadla. Fronta přežije restart služby; neúspěšné spojení se opakuje po 10 sekundách a síťový odesílatel neblokuje konzolovou relaci. Uložení jakékoli konfigurace, včetně změny severity nebo vypnutí, frontu vyprázdní, aby se původní události neposlaly na jiný cíl. TCP/TLS ani stav posledního předání do spojení nepotvrzují trvalé uložení na serveru; při přerušení mohou vzniknout ztráty či duplicity.</w:t>
+      </w:r>
+    </w:p>
+    <w:p>
+      <w:pPr>
+        <w:pStyle w:val="Heading3"/>
+        <w:spacing w:after="140"/>
+      </w:pPr>
+      <w:r>
+        <w:t>Důkazy pro akceptaci</w:t>
+      </w:r>
+    </w:p>
+    <w:p>
+      <w:pPr>
+        <w:spacing w:after="140"/>
+      </w:pPr>
+      <w:r>
+        <w:t>Tlačítko Odeslat testovací zprávu vytváří SYSLOG_TEST version=1.9.1 se zvolenou severity. Potvrzení webu znamená lokální zapsání události; auditor musí doložit příjem v kolektoru. Doplněné testy 11–22 v sešitu pokrývají výchozí vypnutí, hranice severity, povolené zdroje, TLS, rámování, výpadky, zaplnění a vyprázdnění fronty, ochranu nastavení, reset a obnovu. Všechny jsou Nevyhodnoceno, s místem pro skutečný důkaz.</w:t>
+      </w:r>
+    </w:p>
+    <w:p>
+      <w:pPr>
+        <w:spacing w:after="140"/>
+      </w:pPr>
+      <w:r>
+        <w:t>Zdrojové podklady: docs/SYSLOG.md a PR https://github.com/jiriflos-eng/ConsolePi-Plus/pull/22. Místně prošlo 14 kontrol backendu a 6 kontrol webu. Pro audit zaznamenejte také commit nasazeného rozšíření; samotná hodnota VERSION 1.9.1 jej nerozlišuje od původního vydání.</w:t>
+      </w:r>
+    </w:p>
+    <w:p>
+      <w:pPr>
         <w:pStyle w:val="Heading1"/>
       </w:pPr>
       <w:r>

</xml_diff>